<commit_message>
getting on to 13
</commit_message>
<xml_diff>
--- a/docs/ecostats_lectures/lecture_13/13_01_lecture_powerpoint.docx
+++ b/docs/ecostats_lectures/lecture_13/13_01_lecture_powerpoint.docx
@@ -7,7 +7,7 @@
         <w:pStyle w:val="Title"/>
       </w:pPr>
       <w:r>
-        <w:t xml:space="preserve">Lecture 13 - Multifactor ANOVA</w:t>
+        <w:t xml:space="preserve">Lecture 13 - Nested ANOVA</w:t>
       </w:r>
     </w:p>
     <w:p>
@@ -126,7 +126,7 @@
       <w:r>
         <w:drawing>
           <wp:inline>
-            <wp:extent cx="4000500" cy="5968383"/>
+            <wp:extent cx="2324100" cy="3467346"/>
             <wp:effectExtent b="0" l="0" r="0" t="0"/>
             <wp:docPr descr="" title="" id="21" name="Picture"/>
             <a:graphic>
@@ -147,7 +147,7 @@
                   <pic:spPr bwMode="auto">
                     <a:xfrm>
                       <a:off x="0" y="0"/>
-                      <a:ext cx="4000500" cy="5968383"/>
+                      <a:ext cx="2324100" cy="3467346"/>
                     </a:xfrm>
                     <a:prstGeom prst="rect">
                       <a:avLst/>
@@ -255,7 +255,7 @@
       <w:r>
         <w:drawing>
           <wp:inline>
-            <wp:extent cx="4762500" cy="7854739"/>
+            <wp:extent cx="1562100" cy="2576354"/>
             <wp:effectExtent b="0" l="0" r="0" t="0"/>
             <wp:docPr descr="" title="" id="25" name="Picture"/>
             <a:graphic>
@@ -276,7 +276,7 @@
                   <pic:spPr bwMode="auto">
                     <a:xfrm>
                       <a:off x="0" y="0"/>
-                      <a:ext cx="4762500" cy="7854739"/>
+                      <a:ext cx="1562100" cy="2576354"/>
                     </a:xfrm>
                     <a:prstGeom prst="rect">
                       <a:avLst/>
@@ -344,7 +344,7 @@
       <w:r>
         <w:drawing>
           <wp:inline>
-            <wp:extent cx="4762500" cy="8086473"/>
+            <wp:extent cx="2228850" cy="3784469"/>
             <wp:effectExtent b="0" l="0" r="0" t="0"/>
             <wp:docPr descr="" title="" id="29" name="Picture"/>
             <a:graphic>
@@ -365,7 +365,7 @@
                   <pic:spPr bwMode="auto">
                     <a:xfrm>
                       <a:off x="0" y="0"/>
-                      <a:ext cx="4762500" cy="8086473"/>
+                      <a:ext cx="2228850" cy="3784469"/>
                     </a:xfrm>
                     <a:prstGeom prst="rect">
                       <a:avLst/>

</xml_diff>